<commit_message>
more weekly report updates
</commit_message>
<xml_diff>
--- a/Weekly Reports/CS 440 Weekly Report for Week 4.docx
+++ b/Weekly Reports/CS 440 Weekly Report for Week 4.docx
@@ -401,22 +401,10 @@
         </w:numPr>
       </w:pPr>
       <w:r>
-        <w:t xml:space="preserve">Purchase Camera used for Computer Vision </w:t>
-      </w:r>
-    </w:p>
-    <w:p>
-      <w:pPr>
-        <w:pStyle w:val="ListParagraph"/>
-        <w:numPr>
-          <w:ilvl w:val="3"/>
-          <w:numId w:val="2"/>
-        </w:numPr>
-      </w:pPr>
-      <w:r>
-        <w:t xml:space="preserve">Write script to capture frames </w:t>
-      </w:r>
-      <w:r>
-        <w:t xml:space="preserve">and store somewhere </w:t>
+        <w:t>Keep playing around with the live cam splicing feature, and learn how to get them ready to be fed to a CNN</w:t>
+      </w:r>
+      <w:r>
+        <w:t xml:space="preserve"> </w:t>
       </w:r>
     </w:p>
     <w:p>
@@ -444,7 +432,7 @@
         </w:numPr>
       </w:pPr>
       <w:r>
-        <w:t>Research about underground sensors and how to get data</w:t>
+        <w:t>Figure out what exactly to do with the data from the underground sensors</w:t>
       </w:r>
     </w:p>
     <w:p>
@@ -495,7 +483,7 @@
         </w:numPr>
       </w:pPr>
       <w:r>
-        <w:t>Start set up for CNN yolov8 + Test current model with sample content (1 animal)</w:t>
+        <w:t>Keep working on CNN model (figure out how the COCO dataset works)</w:t>
       </w:r>
     </w:p>
     <w:p>
@@ -523,7 +511,7 @@
         </w:numPr>
       </w:pPr>
       <w:r>
-        <w:t>Look into pre-existing solutions to the problem</w:t>
+        <w:t>Keep surfing the web for pre-existing solutions and what can we do differently/better</w:t>
       </w:r>
     </w:p>
     <w:p>

</xml_diff>

<commit_message>
Finalized Weekly Report Week 4
</commit_message>
<xml_diff>
--- a/Weekly Reports/CS 440 Weekly Report for Week 4.docx
+++ b/Weekly Reports/CS 440 Weekly Report for Week 4.docx
@@ -294,6 +294,9 @@
       <w:r>
         <w:t xml:space="preserve"> Came up with stakeholders for the design project and the implementation project</w:t>
       </w:r>
+      <w:r>
+        <w:t xml:space="preserve"> </w:t>
+      </w:r>
     </w:p>
     <w:p>
       <w:pPr>
@@ -432,7 +435,7 @@
         </w:numPr>
       </w:pPr>
       <w:r>
-        <w:t>Figure out what exactly to do with the data from the underground sensors</w:t>
+        <w:t>3b, Competing Products</w:t>
       </w:r>
     </w:p>
     <w:p>
@@ -511,7 +514,7 @@
         </w:numPr>
       </w:pPr>
       <w:r>
-        <w:t>Keep surfing the web for pre-existing solutions and what can we do differently/better</w:t>
+        <w:t>3a, Work Partitioning in Design Doc</w:t>
       </w:r>
     </w:p>
     <w:p>
@@ -547,6 +550,31 @@
         </w:rPr>
         <w:t xml:space="preserve">Implementation: </w:t>
       </w:r>
+      <w:r>
+        <w:t>Pivot</w:t>
+      </w:r>
+      <w:r>
+        <w:t xml:space="preserve"> to researching how the camera can be paired</w:t>
+      </w:r>
+      <w:r>
+        <w:t xml:space="preserve"> with the code while waiting for model to be implemented</w:t>
+      </w:r>
+    </w:p>
+    <w:p>
+      <w:pPr>
+        <w:pStyle w:val="ListParagraph"/>
+        <w:numPr>
+          <w:ilvl w:val="1"/>
+          <w:numId w:val="2"/>
+        </w:numPr>
+      </w:pPr>
+      <w:r>
+        <w:rPr>
+          <w:b/>
+          <w:bCs/>
+        </w:rPr>
+        <w:t xml:space="preserve">Design: </w:t>
+      </w:r>
     </w:p>
     <w:p>
       <w:pPr>
@@ -557,7 +585,43 @@
         </w:numPr>
       </w:pPr>
       <w:r>
-        <w:t>Figure out which microcontroller is best suited for the prototype</w:t>
+        <w:t>Finish designing the</w:t>
+      </w:r>
+      <w:r>
+        <w:t xml:space="preserve"> architecture and UML diagram</w:t>
+      </w:r>
+      <w:r>
+        <w:t xml:space="preserve"> (Draft in #7 of Design Doc)</w:t>
+      </w:r>
+    </w:p>
+    <w:p>
+      <w:pPr>
+        <w:pStyle w:val="ListParagraph"/>
+        <w:numPr>
+          <w:ilvl w:val="2"/>
+          <w:numId w:val="2"/>
+        </w:numPr>
+      </w:pPr>
+      <w:r>
+        <w:t>Begin/Continue #2 if able</w:t>
+      </w:r>
+    </w:p>
+    <w:p>
+      <w:pPr>
+        <w:pStyle w:val="ListParagraph"/>
+        <w:numPr>
+          <w:ilvl w:val="0"/>
+          <w:numId w:val="2"/>
+        </w:numPr>
+      </w:pPr>
+      <w:r>
+        <w:t>Lena Tran</w:t>
+      </w:r>
+      <w:r>
+        <w:t>:</w:t>
+      </w:r>
+      <w:r>
+        <w:t xml:space="preserve"> </w:t>
       </w:r>
     </w:p>
     <w:p>
@@ -573,6 +637,25 @@
           <w:b/>
           <w:bCs/>
         </w:rPr>
+        <w:t xml:space="preserve">Implementation: </w:t>
+      </w:r>
+      <w:r>
+        <w:t>Paused the UI research and assist with the model integration if needed</w:t>
+      </w:r>
+    </w:p>
+    <w:p>
+      <w:pPr>
+        <w:pStyle w:val="ListParagraph"/>
+        <w:numPr>
+          <w:ilvl w:val="1"/>
+          <w:numId w:val="2"/>
+        </w:numPr>
+      </w:pPr>
+      <w:r>
+        <w:rPr>
+          <w:b/>
+          <w:bCs/>
+        </w:rPr>
         <w:t xml:space="preserve">Design: </w:t>
       </w:r>
     </w:p>
@@ -585,81 +668,34 @@
         </w:numPr>
       </w:pPr>
       <w:r>
-        <w:t>Plan out the architecture and start working on UML diagram</w:t>
-      </w:r>
-    </w:p>
-    <w:p>
-      <w:pPr>
-        <w:pStyle w:val="ListParagraph"/>
-        <w:numPr>
-          <w:ilvl w:val="0"/>
-          <w:numId w:val="2"/>
-        </w:numPr>
-      </w:pPr>
-      <w:r>
-        <w:t>Lena Tran</w:t>
-      </w:r>
-      <w:r>
-        <w:t>:</w:t>
+        <w:t>Formalize Section 5 of the Design Document using the findings</w:t>
+      </w:r>
+    </w:p>
+    <w:p>
+      <w:pPr>
+        <w:pStyle w:val="ListParagraph"/>
+        <w:numPr>
+          <w:ilvl w:val="2"/>
+          <w:numId w:val="2"/>
+        </w:numPr>
+      </w:pPr>
+      <w:r>
+        <w:t>Begin drafting formal explanations for Project Description and Overview</w:t>
+      </w:r>
+    </w:p>
+    <w:p>
+      <w:pPr>
+        <w:pStyle w:val="ListParagraph"/>
+        <w:numPr>
+          <w:ilvl w:val="2"/>
+          <w:numId w:val="2"/>
+        </w:numPr>
+      </w:pPr>
+      <w:r>
+        <w:t>Begin #2 if able</w:t>
       </w:r>
       <w:r>
         <w:t xml:space="preserve"> </w:t>
-      </w:r>
-    </w:p>
-    <w:p>
-      <w:pPr>
-        <w:pStyle w:val="ListParagraph"/>
-        <w:numPr>
-          <w:ilvl w:val="1"/>
-          <w:numId w:val="2"/>
-        </w:numPr>
-      </w:pPr>
-      <w:r>
-        <w:rPr>
-          <w:b/>
-          <w:bCs/>
-        </w:rPr>
-        <w:t xml:space="preserve">Implementation: </w:t>
-      </w:r>
-    </w:p>
-    <w:p>
-      <w:pPr>
-        <w:pStyle w:val="ListParagraph"/>
-        <w:numPr>
-          <w:ilvl w:val="2"/>
-          <w:numId w:val="2"/>
-        </w:numPr>
-      </w:pPr>
-      <w:r>
-        <w:t>Look into what they planned for the UI and figure out how to implement</w:t>
-      </w:r>
-    </w:p>
-    <w:p>
-      <w:pPr>
-        <w:pStyle w:val="ListParagraph"/>
-        <w:numPr>
-          <w:ilvl w:val="1"/>
-          <w:numId w:val="2"/>
-        </w:numPr>
-      </w:pPr>
-      <w:r>
-        <w:rPr>
-          <w:b/>
-          <w:bCs/>
-        </w:rPr>
-        <w:t xml:space="preserve">Design: </w:t>
-      </w:r>
-    </w:p>
-    <w:p>
-      <w:pPr>
-        <w:pStyle w:val="ListParagraph"/>
-        <w:numPr>
-          <w:ilvl w:val="2"/>
-          <w:numId w:val="2"/>
-        </w:numPr>
-      </w:pPr>
-      <w:r>
-        <w:t>Research the stakeholders and current workflow of whoever is involved</w:t>
       </w:r>
     </w:p>
     <w:sectPr>

</xml_diff>